<commit_message>
atualização em algumas coisas no projeto de redes
</commit_message>
<xml_diff>
--- a/3 semestre/Redes de computadores/Projeto de Redes.docx
+++ b/3 semestre/Redes de computadores/Projeto de Redes.docx
@@ -26,12 +26,14 @@
       <w:pPr>
         <w:rPr>
           <w:rFonts w:ascii="Times New Roman" w:hAnsi="Times New Roman" w:cs="Times New Roman"/>
+          <w:color w:val="0F4761" w:themeColor="accent1" w:themeShade="BF"/>
           <w:lang w:val="en-US"/>
         </w:rPr>
       </w:pPr>
       <w:r>
         <w:rPr>
           <w:rFonts w:ascii="Times New Roman" w:hAnsi="Times New Roman" w:cs="Times New Roman"/>
+          <w:color w:val="0F4761" w:themeColor="accent1" w:themeShade="BF"/>
           <w:lang w:val="en-US"/>
         </w:rPr>
         <w:t>Ro</w:t>
@@ -39,6 +41,7 @@
       <w:r>
         <w:rPr>
           <w:rFonts w:ascii="Times New Roman" w:hAnsi="Times New Roman" w:cs="Times New Roman"/>
+          <w:color w:val="0F4761" w:themeColor="accent1" w:themeShade="BF"/>
           <w:lang w:val="en-US"/>
         </w:rPr>
         <w:t>uter 0</w:t>
@@ -46,6 +49,7 @@
       <w:r>
         <w:rPr>
           <w:rFonts w:ascii="Times New Roman" w:hAnsi="Times New Roman" w:cs="Times New Roman"/>
+          <w:color w:val="0F4761" w:themeColor="accent1" w:themeShade="BF"/>
           <w:lang w:val="en-US"/>
         </w:rPr>
         <w:t>:</w:t>
@@ -366,12 +370,14 @@
       <w:pPr>
         <w:rPr>
           <w:rFonts w:ascii="Times New Roman" w:hAnsi="Times New Roman" w:cs="Times New Roman"/>
+          <w:color w:val="0F4761" w:themeColor="accent1" w:themeShade="BF"/>
           <w:lang w:val="en-US"/>
         </w:rPr>
       </w:pPr>
       <w:r>
         <w:rPr>
           <w:rFonts w:ascii="Times New Roman" w:hAnsi="Times New Roman" w:cs="Times New Roman"/>
+          <w:color w:val="0F4761" w:themeColor="accent1" w:themeShade="BF"/>
           <w:lang w:val="en-US"/>
         </w:rPr>
         <w:t>Router 1:</w:t>
@@ -752,12 +758,14 @@
       <w:pPr>
         <w:rPr>
           <w:rFonts w:ascii="Times New Roman" w:hAnsi="Times New Roman" w:cs="Times New Roman"/>
+          <w:color w:val="0F4761" w:themeColor="accent1" w:themeShade="BF"/>
           <w:lang w:val="en-US"/>
         </w:rPr>
       </w:pPr>
       <w:r>
         <w:rPr>
           <w:rFonts w:ascii="Times New Roman" w:hAnsi="Times New Roman" w:cs="Times New Roman"/>
+          <w:color w:val="0F4761" w:themeColor="accent1" w:themeShade="BF"/>
           <w:lang w:val="en-US"/>
         </w:rPr>
         <w:t>Router 2:</w:t>
@@ -1002,11 +1010,13 @@
       <w:pPr>
         <w:rPr>
           <w:rFonts w:ascii="Times New Roman" w:hAnsi="Times New Roman" w:cs="Times New Roman"/>
+          <w:color w:val="C00000"/>
         </w:rPr>
       </w:pPr>
       <w:r>
         <w:rPr>
           <w:rFonts w:ascii="Times New Roman" w:hAnsi="Times New Roman" w:cs="Times New Roman"/>
+          <w:color w:val="C00000"/>
         </w:rPr>
         <w:t>LAN 1:</w:t>
       </w:r>
@@ -1015,12 +1025,14 @@
       <w:pPr>
         <w:rPr>
           <w:rFonts w:ascii="Times New Roman" w:hAnsi="Times New Roman" w:cs="Times New Roman"/>
+          <w:color w:val="0F4761" w:themeColor="accent1" w:themeShade="BF"/>
         </w:rPr>
       </w:pPr>
       <w:proofErr w:type="spellStart"/>
       <w:r>
         <w:rPr>
           <w:rFonts w:ascii="Times New Roman" w:hAnsi="Times New Roman" w:cs="Times New Roman"/>
+          <w:color w:val="0F4761" w:themeColor="accent1" w:themeShade="BF"/>
         </w:rPr>
         <w:t>Sub-Rede</w:t>
       </w:r>
@@ -1028,18 +1040,21 @@
       <w:r>
         <w:rPr>
           <w:rFonts w:ascii="Times New Roman" w:hAnsi="Times New Roman" w:cs="Times New Roman"/>
+          <w:color w:val="0F4761" w:themeColor="accent1" w:themeShade="BF"/>
         </w:rPr>
         <w:t xml:space="preserve"> (01):120.20.30.</w:t>
       </w:r>
       <w:r>
         <w:rPr>
           <w:rFonts w:ascii="Times New Roman" w:hAnsi="Times New Roman" w:cs="Times New Roman"/>
+          <w:color w:val="0F4761" w:themeColor="accent1" w:themeShade="BF"/>
         </w:rPr>
         <w:t>0</w:t>
       </w:r>
       <w:r>
         <w:rPr>
           <w:rFonts w:ascii="Times New Roman" w:hAnsi="Times New Roman" w:cs="Times New Roman"/>
+          <w:color w:val="0F4761" w:themeColor="accent1" w:themeShade="BF"/>
         </w:rPr>
         <w:t>/25 - 255.255.255.128</w:t>
       </w:r>
@@ -1343,11 +1358,13 @@
       <w:pPr>
         <w:rPr>
           <w:rFonts w:ascii="Times New Roman" w:hAnsi="Times New Roman" w:cs="Times New Roman"/>
+          <w:color w:val="0F4761" w:themeColor="accent1" w:themeShade="BF"/>
         </w:rPr>
       </w:pPr>
       <w:r>
         <w:rPr>
           <w:rFonts w:ascii="Times New Roman" w:hAnsi="Times New Roman" w:cs="Times New Roman"/>
+          <w:color w:val="0F4761" w:themeColor="accent1" w:themeShade="BF"/>
         </w:rPr>
         <w:t xml:space="preserve">Intervalo de </w:t>
       </w:r>
@@ -1355,6 +1372,7 @@
       <w:r>
         <w:rPr>
           <w:rFonts w:ascii="Times New Roman" w:hAnsi="Times New Roman" w:cs="Times New Roman"/>
+          <w:color w:val="0F4761" w:themeColor="accent1" w:themeShade="BF"/>
         </w:rPr>
         <w:t>IPs</w:t>
       </w:r>
@@ -1362,6 +1380,7 @@
       <w:r>
         <w:rPr>
           <w:rFonts w:ascii="Times New Roman" w:hAnsi="Times New Roman" w:cs="Times New Roman"/>
+          <w:color w:val="0F4761" w:themeColor="accent1" w:themeShade="BF"/>
         </w:rPr>
         <w:t xml:space="preserve"> da </w:t>
       </w:r>
@@ -1369,6 +1388,7 @@
       <w:r>
         <w:rPr>
           <w:rFonts w:ascii="Times New Roman" w:hAnsi="Times New Roman" w:cs="Times New Roman"/>
+          <w:color w:val="0F4761" w:themeColor="accent1" w:themeShade="BF"/>
         </w:rPr>
         <w:t>Sub-Rede</w:t>
       </w:r>
@@ -1376,6 +1396,7 @@
       <w:r>
         <w:rPr>
           <w:rFonts w:ascii="Times New Roman" w:hAnsi="Times New Roman" w:cs="Times New Roman"/>
+          <w:color w:val="0F4761" w:themeColor="accent1" w:themeShade="BF"/>
         </w:rPr>
         <w:t xml:space="preserve"> (01):</w:t>
       </w:r>
@@ -1735,12 +1756,14 @@
       <w:pPr>
         <w:rPr>
           <w:rFonts w:ascii="Times New Roman" w:hAnsi="Times New Roman" w:cs="Times New Roman"/>
+          <w:color w:val="0F4761" w:themeColor="accent1" w:themeShade="BF"/>
         </w:rPr>
       </w:pPr>
       <w:proofErr w:type="spellStart"/>
       <w:r>
         <w:rPr>
           <w:rFonts w:ascii="Times New Roman" w:hAnsi="Times New Roman" w:cs="Times New Roman"/>
+          <w:color w:val="0F4761" w:themeColor="accent1" w:themeShade="BF"/>
         </w:rPr>
         <w:t>Sub-</w:t>
       </w:r>
@@ -1748,6 +1771,7 @@
       <w:r>
         <w:rPr>
           <w:rFonts w:ascii="Times New Roman" w:hAnsi="Times New Roman" w:cs="Times New Roman"/>
+          <w:color w:val="0F4761" w:themeColor="accent1" w:themeShade="BF"/>
         </w:rPr>
         <w:t>Rede</w:t>
       </w:r>
@@ -1755,6 +1779,7 @@
       <w:r>
         <w:rPr>
           <w:rFonts w:ascii="Times New Roman" w:hAnsi="Times New Roman" w:cs="Times New Roman"/>
+          <w:color w:val="0F4761" w:themeColor="accent1" w:themeShade="BF"/>
         </w:rPr>
         <w:t>(</w:t>
       </w:r>
@@ -1762,6 +1787,7 @@
       <w:r>
         <w:rPr>
           <w:rFonts w:ascii="Times New Roman" w:hAnsi="Times New Roman" w:cs="Times New Roman"/>
+          <w:color w:val="0F4761" w:themeColor="accent1" w:themeShade="BF"/>
         </w:rPr>
         <w:t>02): 120.20.30.128/26 - 255.255.255.192</w:t>
       </w:r>
@@ -2257,11 +2283,13 @@
       <w:pPr>
         <w:rPr>
           <w:rFonts w:ascii="Times New Roman" w:hAnsi="Times New Roman" w:cs="Times New Roman"/>
+          <w:color w:val="0F4761" w:themeColor="accent1" w:themeShade="BF"/>
         </w:rPr>
       </w:pPr>
       <w:r>
         <w:rPr>
           <w:rFonts w:ascii="Times New Roman" w:hAnsi="Times New Roman" w:cs="Times New Roman"/>
+          <w:color w:val="0F4761" w:themeColor="accent1" w:themeShade="BF"/>
         </w:rPr>
         <w:lastRenderedPageBreak/>
         <w:t xml:space="preserve">Intervalo de IP da </w:t>
@@ -2270,6 +2298,7 @@
       <w:r>
         <w:rPr>
           <w:rFonts w:ascii="Times New Roman" w:hAnsi="Times New Roman" w:cs="Times New Roman"/>
+          <w:color w:val="0F4761" w:themeColor="accent1" w:themeShade="BF"/>
         </w:rPr>
         <w:t>Sub-Rede</w:t>
       </w:r>
@@ -2277,20 +2306,9 @@
       <w:r>
         <w:rPr>
           <w:rFonts w:ascii="Times New Roman" w:hAnsi="Times New Roman" w:cs="Times New Roman"/>
-        </w:rPr>
-        <w:t xml:space="preserve"> (0</w:t>
-      </w:r>
-      <w:r>
-        <w:rPr>
-          <w:rFonts w:ascii="Times New Roman" w:hAnsi="Times New Roman" w:cs="Times New Roman"/>
-        </w:rPr>
-        <w:t>2</w:t>
-      </w:r>
-      <w:r>
-        <w:rPr>
-          <w:rFonts w:ascii="Times New Roman" w:hAnsi="Times New Roman" w:cs="Times New Roman"/>
-        </w:rPr>
-        <w:t>):</w:t>
+          <w:color w:val="0F4761" w:themeColor="accent1" w:themeShade="BF"/>
+        </w:rPr>
+        <w:t xml:space="preserve"> (02):</w:t>
       </w:r>
     </w:p>
     <w:tbl>
@@ -2697,11 +2715,13 @@
       <w:pPr>
         <w:rPr>
           <w:rFonts w:ascii="Times New Roman" w:hAnsi="Times New Roman" w:cs="Times New Roman"/>
+          <w:color w:val="C00000"/>
         </w:rPr>
       </w:pPr>
       <w:r>
         <w:rPr>
           <w:rFonts w:ascii="Times New Roman" w:hAnsi="Times New Roman" w:cs="Times New Roman"/>
+          <w:color w:val="C00000"/>
         </w:rPr>
         <w:t>LAN 2:</w:t>
       </w:r>
@@ -2710,12 +2730,14 @@
       <w:pPr>
         <w:rPr>
           <w:rFonts w:ascii="Times New Roman" w:hAnsi="Times New Roman" w:cs="Times New Roman"/>
+          <w:color w:val="0F4761" w:themeColor="accent1" w:themeShade="BF"/>
         </w:rPr>
       </w:pPr>
       <w:proofErr w:type="spellStart"/>
       <w:r>
         <w:rPr>
           <w:rFonts w:ascii="Times New Roman" w:hAnsi="Times New Roman" w:cs="Times New Roman"/>
+          <w:color w:val="0F4761" w:themeColor="accent1" w:themeShade="BF"/>
         </w:rPr>
         <w:t>Sub-Rede</w:t>
       </w:r>
@@ -2723,50 +2745,37 @@
       <w:r>
         <w:rPr>
           <w:rFonts w:ascii="Times New Roman" w:hAnsi="Times New Roman" w:cs="Times New Roman"/>
+          <w:color w:val="0F4761" w:themeColor="accent1" w:themeShade="BF"/>
         </w:rPr>
         <w:t xml:space="preserve"> única</w:t>
       </w:r>
       <w:r>
         <w:rPr>
           <w:rFonts w:ascii="Times New Roman" w:hAnsi="Times New Roman" w:cs="Times New Roman"/>
+          <w:color w:val="0F4761" w:themeColor="accent1" w:themeShade="BF"/>
         </w:rPr>
         <w:t xml:space="preserve"> 192.168.</w:t>
       </w:r>
       <w:r>
         <w:rPr>
           <w:rFonts w:ascii="Times New Roman" w:hAnsi="Times New Roman" w:cs="Times New Roman"/>
+          <w:color w:val="0F4761" w:themeColor="accent1" w:themeShade="BF"/>
         </w:rPr>
         <w:t>0</w:t>
       </w:r>
       <w:r>
         <w:rPr>
           <w:rFonts w:ascii="Times New Roman" w:hAnsi="Times New Roman" w:cs="Times New Roman"/>
+          <w:color w:val="0F4761" w:themeColor="accent1" w:themeShade="BF"/>
         </w:rPr>
         <w:t>.0/18 - 255.255.192.0</w:t>
       </w:r>
       <w:r>
         <w:rPr>
           <w:rFonts w:ascii="Times New Roman" w:hAnsi="Times New Roman" w:cs="Times New Roman"/>
-        </w:rPr>
-        <w:t xml:space="preserve"> e </w:t>
-      </w:r>
-      <w:r>
-        <w:rPr>
-          <w:rFonts w:ascii="Times New Roman" w:hAnsi="Times New Roman" w:cs="Times New Roman"/>
-        </w:rPr>
-        <w:t>192.168.</w:t>
-      </w:r>
-      <w:r>
-        <w:rPr>
-          <w:rFonts w:ascii="Times New Roman" w:hAnsi="Times New Roman" w:cs="Times New Roman"/>
-        </w:rPr>
-        <w:t>64</w:t>
-      </w:r>
-      <w:r>
-        <w:rPr>
-          <w:rFonts w:ascii="Times New Roman" w:hAnsi="Times New Roman" w:cs="Times New Roman"/>
-        </w:rPr>
-        <w:t>.0/18</w:t>
+          <w:color w:val="0F4761" w:themeColor="accent1" w:themeShade="BF"/>
+        </w:rPr>
+        <w:t xml:space="preserve"> e 192.168.64.0/18</w:t>
       </w:r>
     </w:p>
     <w:tbl>
@@ -3284,11 +3293,13 @@
       <w:pPr>
         <w:rPr>
           <w:rFonts w:ascii="Times New Roman" w:hAnsi="Times New Roman" w:cs="Times New Roman"/>
+          <w:color w:val="0F4761" w:themeColor="accent1" w:themeShade="BF"/>
         </w:rPr>
       </w:pPr>
       <w:r>
         <w:rPr>
           <w:rFonts w:ascii="Times New Roman" w:hAnsi="Times New Roman" w:cs="Times New Roman"/>
+          <w:color w:val="0F4761" w:themeColor="accent1" w:themeShade="BF"/>
         </w:rPr>
         <w:t xml:space="preserve">Intervalo de </w:t>
       </w:r>
@@ -3296,6 +3307,7 @@
       <w:r>
         <w:rPr>
           <w:rFonts w:ascii="Times New Roman" w:hAnsi="Times New Roman" w:cs="Times New Roman"/>
+          <w:color w:val="0F4761" w:themeColor="accent1" w:themeShade="BF"/>
         </w:rPr>
         <w:t>IPs</w:t>
       </w:r>
@@ -3303,38 +3315,23 @@
       <w:r>
         <w:rPr>
           <w:rFonts w:ascii="Times New Roman" w:hAnsi="Times New Roman" w:cs="Times New Roman"/>
-        </w:rPr>
-        <w:t xml:space="preserve"> da</w:t>
-      </w:r>
-      <w:r>
-        <w:rPr>
-          <w:rFonts w:ascii="Times New Roman" w:hAnsi="Times New Roman" w:cs="Times New Roman"/>
-        </w:rPr>
-        <w:t>s</w:t>
-      </w:r>
-      <w:r>
-        <w:rPr>
-          <w:rFonts w:ascii="Times New Roman" w:hAnsi="Times New Roman" w:cs="Times New Roman"/>
-        </w:rPr>
-        <w:t xml:space="preserve"> </w:t>
+          <w:color w:val="0F4761" w:themeColor="accent1" w:themeShade="BF"/>
+        </w:rPr>
+        <w:t xml:space="preserve"> das </w:t>
       </w:r>
       <w:proofErr w:type="spellStart"/>
       <w:r>
         <w:rPr>
           <w:rFonts w:ascii="Times New Roman" w:hAnsi="Times New Roman" w:cs="Times New Roman"/>
-        </w:rPr>
-        <w:t>Sub-Rede</w:t>
-      </w:r>
-      <w:r>
-        <w:rPr>
-          <w:rFonts w:ascii="Times New Roman" w:hAnsi="Times New Roman" w:cs="Times New Roman"/>
-        </w:rPr>
-        <w:t>s</w:t>
+          <w:color w:val="0F4761" w:themeColor="accent1" w:themeShade="BF"/>
+        </w:rPr>
+        <w:t>Sub-Redes</w:t>
       </w:r>
       <w:proofErr w:type="spellEnd"/>
       <w:r>
         <w:rPr>
           <w:rFonts w:ascii="Times New Roman" w:hAnsi="Times New Roman" w:cs="Times New Roman"/>
+          <w:color w:val="0F4761" w:themeColor="accent1" w:themeShade="BF"/>
         </w:rPr>
         <w:t>:</w:t>
       </w:r>
@@ -3859,23 +3856,27 @@
       <w:pPr>
         <w:rPr>
           <w:rFonts w:ascii="Times New Roman" w:hAnsi="Times New Roman" w:cs="Times New Roman"/>
+          <w:color w:val="C00000"/>
         </w:rPr>
       </w:pPr>
       <w:r>
         <w:rPr>
           <w:rFonts w:ascii="Times New Roman" w:hAnsi="Times New Roman" w:cs="Times New Roman"/>
+          <w:color w:val="C00000"/>
         </w:rPr>
         <w:t>Lan 3</w:t>
       </w:r>
       <w:r>
         <w:rPr>
           <w:rFonts w:ascii="Times New Roman" w:hAnsi="Times New Roman" w:cs="Times New Roman"/>
+          <w:color w:val="C00000"/>
         </w:rPr>
         <w:t xml:space="preserve"> (Protocolo DHCP)</w:t>
       </w:r>
       <w:r>
         <w:rPr>
           <w:rFonts w:ascii="Times New Roman" w:hAnsi="Times New Roman" w:cs="Times New Roman"/>
+          <w:color w:val="C00000"/>
         </w:rPr>
         <w:t>:</w:t>
       </w:r>
@@ -4579,13 +4580,7 @@
               <w:rPr>
                 <w:rFonts w:ascii="Times New Roman" w:hAnsi="Times New Roman" w:cs="Times New Roman"/>
               </w:rPr>
-              <w:t>Laptop</w:t>
-            </w:r>
-            <w:r>
-              <w:rPr>
-                <w:rFonts w:ascii="Times New Roman" w:hAnsi="Times New Roman" w:cs="Times New Roman"/>
-              </w:rPr>
-              <w:t>1</w:t>
+              <w:t>Laptop1</w:t>
             </w:r>
           </w:p>
         </w:tc>
@@ -4669,13 +4664,7 @@
               <w:rPr>
                 <w:rFonts w:ascii="Times New Roman" w:hAnsi="Times New Roman" w:cs="Times New Roman"/>
               </w:rPr>
-              <w:t>Laptop</w:t>
-            </w:r>
-            <w:r>
-              <w:rPr>
-                <w:rFonts w:ascii="Times New Roman" w:hAnsi="Times New Roman" w:cs="Times New Roman"/>
-              </w:rPr>
-              <w:t>2</w:t>
+              <w:t>Laptop2</w:t>
             </w:r>
           </w:p>
         </w:tc>
@@ -4755,11 +4744,13 @@
       <w:pPr>
         <w:rPr>
           <w:rFonts w:ascii="Times New Roman" w:hAnsi="Times New Roman" w:cs="Times New Roman"/>
+          <w:color w:val="0F4761" w:themeColor="accent1" w:themeShade="BF"/>
         </w:rPr>
       </w:pPr>
       <w:r>
         <w:rPr>
           <w:rFonts w:ascii="Times New Roman" w:hAnsi="Times New Roman" w:cs="Times New Roman"/>
+          <w:color w:val="0F4761" w:themeColor="accent1" w:themeShade="BF"/>
         </w:rPr>
         <w:t xml:space="preserve">Intervalo de IP da </w:t>
       </w:r>
@@ -4767,6 +4758,7 @@
       <w:r>
         <w:rPr>
           <w:rFonts w:ascii="Times New Roman" w:hAnsi="Times New Roman" w:cs="Times New Roman"/>
+          <w:color w:val="0F4761" w:themeColor="accent1" w:themeShade="BF"/>
         </w:rPr>
         <w:t>Sub-</w:t>
       </w:r>
@@ -4774,6 +4766,7 @@
       <w:r>
         <w:rPr>
           <w:rFonts w:ascii="Times New Roman" w:hAnsi="Times New Roman" w:cs="Times New Roman"/>
+          <w:color w:val="0F4761" w:themeColor="accent1" w:themeShade="BF"/>
         </w:rPr>
         <w:t>Rede</w:t>
       </w:r>
@@ -4781,6 +4774,7 @@
       <w:r>
         <w:rPr>
           <w:rFonts w:ascii="Times New Roman" w:hAnsi="Times New Roman" w:cs="Times New Roman"/>
+          <w:color w:val="0F4761" w:themeColor="accent1" w:themeShade="BF"/>
         </w:rPr>
         <w:t xml:space="preserve"> :</w:t>
       </w:r>
@@ -5182,6 +5176,7 @@
       <w:pPr>
         <w:rPr>
           <w:rFonts w:ascii="Times New Roman" w:hAnsi="Times New Roman" w:cs="Times New Roman"/>
+          <w:color w:val="0F4761" w:themeColor="accent1" w:themeShade="BF"/>
           <w:lang w:val="en-US"/>
         </w:rPr>
       </w:pPr>
@@ -5189,6 +5184,7 @@
       <w:r>
         <w:rPr>
           <w:rFonts w:ascii="Times New Roman" w:hAnsi="Times New Roman" w:cs="Times New Roman"/>
+          <w:color w:val="0F4761" w:themeColor="accent1" w:themeShade="BF"/>
           <w:lang w:val="en-US"/>
         </w:rPr>
         <w:t>Acess</w:t>
@@ -5197,6 +5193,7 @@
       <w:r>
         <w:rPr>
           <w:rFonts w:ascii="Times New Roman" w:hAnsi="Times New Roman" w:cs="Times New Roman"/>
+          <w:color w:val="0F4761" w:themeColor="accent1" w:themeShade="BF"/>
           <w:lang w:val="en-US"/>
         </w:rPr>
         <w:t>-point com WPA2-PSK:</w:t>
@@ -5219,14 +5216,14 @@
       <w:pPr>
         <w:rPr>
           <w:rFonts w:ascii="Times New Roman" w:hAnsi="Times New Roman" w:cs="Times New Roman"/>
-          <w:color w:val="EE0000"/>
+          <w:color w:val="0F4761" w:themeColor="accent1" w:themeShade="BF"/>
         </w:rPr>
       </w:pPr>
       <w:proofErr w:type="spellStart"/>
       <w:r>
         <w:rPr>
           <w:rFonts w:ascii="Times New Roman" w:hAnsi="Times New Roman" w:cs="Times New Roman"/>
-          <w:color w:val="EE0000"/>
+          <w:color w:val="0F4761" w:themeColor="accent1" w:themeShade="BF"/>
         </w:rPr>
         <w:t>Acl</w:t>
       </w:r>
@@ -5234,16 +5231,9 @@
       <w:r>
         <w:rPr>
           <w:rFonts w:ascii="Times New Roman" w:hAnsi="Times New Roman" w:cs="Times New Roman"/>
-          <w:color w:val="EE0000"/>
-        </w:rPr>
-        <w:t xml:space="preserve"> para limitar o acesso da LAN3 para LAN2</w:t>
-      </w:r>
-      <w:r>
-        <w:rPr>
-          <w:rFonts w:ascii="Times New Roman" w:hAnsi="Times New Roman" w:cs="Times New Roman"/>
-          <w:color w:val="EE0000"/>
-        </w:rPr>
-        <w:t>:</w:t>
+          <w:color w:val="0F4761" w:themeColor="accent1" w:themeShade="BF"/>
+        </w:rPr>
+        <w:t xml:space="preserve"> para limitar o acesso da LAN3 para LAN2:</w:t>
       </w:r>
     </w:p>
     <w:p>
@@ -6092,6 +6082,7 @@
   <w:style w:type="character" w:default="1" w:styleId="Fontepargpadro">
     <w:name w:val="Default Paragraph Font"/>
     <w:uiPriority w:val="1"/>
+    <w:semiHidden/>
     <w:unhideWhenUsed/>
   </w:style>
   <w:style w:type="table" w:default="1" w:styleId="Tabelanormal">

</xml_diff>